<commit_message>
oppdatert design og mobilvisning
</commit_message>
<xml_diff>
--- a/SaaS ideer.docx
+++ b/SaaS ideer.docx
@@ -1,6 +1,6 @@
 
 <file path=word/document.xml><?xml version="1.0" encoding="utf-8"?>
-<w:document xmlns:wpc="http://schemas.microsoft.com/office/word/2010/wordprocessingCanvas" xmlns:cx="http://schemas.microsoft.com/office/drawing/2014/chartex" xmlns:cx1="http://schemas.microsoft.com/office/drawing/2015/9/8/chartex" xmlns:cx2="http://schemas.microsoft.com/office/drawing/2015/10/21/chartex" xmlns:cx3="http://schemas.microsoft.com/office/drawing/2016/5/9/chartex" xmlns:cx4="http://schemas.microsoft.com/office/drawing/2016/5/10/chartex" xmlns:cx5="http://schemas.microsoft.com/office/drawing/2016/5/11/chartex" xmlns:cx6="http://schemas.microsoft.com/office/drawing/2016/5/12/chartex" xmlns:cx7="http://schemas.microsoft.com/office/drawing/2016/5/13/chartex" xmlns:cx8="http://schemas.microsoft.com/office/drawing/2016/5/14/chartex" xmlns:mc="http://schemas.openxmlformats.org/markup-compatibility/2006" xmlns:aink="http://schemas.microsoft.com/office/drawing/2016/ink" xmlns:am3d="http://schemas.microsoft.com/office/drawing/2017/model3d" xmlns:o="urn:schemas-microsoft-com:office:office" xmlns:oel="http://schemas.microsoft.com/office/2019/extlst" xmlns:r="http://schemas.openxmlformats.org/officeDocument/2006/relationships" xmlns:m="http://schemas.openxmlformats.org/officeDocument/2006/math" xmlns:v="urn:schemas-microsoft-com:vml" xmlns:wp14="http://schemas.microsoft.com/office/word/2010/wordprocessingDrawing" xmlns:wp="http://schemas.openxmlformats.org/drawingml/2006/wordprocessingDrawing" xmlns:w10="urn:schemas-microsoft-com:office:word" xmlns:w="http://schemas.openxmlformats.org/wordprocessingml/2006/main" xmlns:w14="http://schemas.microsoft.com/office/word/2010/wordml" xmlns:w15="http://schemas.microsoft.com/office/word/2012/wordml" xmlns:w16cei="http://schemas.microsoft.com/office/word/2026/wordml/cei" xmlns:w16cex="http://schemas.microsoft.com/office/word/2018/wordml/cex" xmlns:w16cid="http://schemas.microsoft.com/office/word/2016/wordml/cid" xmlns:w16="http://schemas.microsoft.com/office/word/2018/wordml" xmlns:w16du="http://schemas.microsoft.com/office/word/2023/wordml/word16du" xmlns:w16sdtdh="http://schemas.microsoft.com/office/word/2020/wordml/sdtdatahash" xmlns:w16sdtfl="http://schemas.microsoft.com/office/word/2024/wordml/sdtformatlock" xmlns:w16se="http://schemas.microsoft.com/office/word/2015/wordml/symex" xmlns:wpg="http://schemas.microsoft.com/office/word/2010/wordprocessingGroup" xmlns:wpi="http://schemas.microsoft.com/office/word/2010/wordprocessingInk" xmlns:wne="http://schemas.microsoft.com/office/word/2006/wordml" xmlns:wps="http://schemas.microsoft.com/office/word/2010/wordprocessingShape" mc:Ignorable="w14 w15 w16se w16cid w16 w16cex w16sdtdh w16sdtfl w16du wp14">
+<w:document xmlns:wpc="http://schemas.microsoft.com/office/word/2010/wordprocessingCanvas" xmlns:cx="http://schemas.microsoft.com/office/drawing/2014/chartex" xmlns:cx1="http://schemas.microsoft.com/office/drawing/2015/9/8/chartex" xmlns:cx2="http://schemas.microsoft.com/office/drawing/2015/10/21/chartex" xmlns:cx3="http://schemas.microsoft.com/office/drawing/2016/5/9/chartex" xmlns:cx4="http://schemas.microsoft.com/office/drawing/2016/5/10/chartex" xmlns:cx5="http://schemas.microsoft.com/office/drawing/2016/5/11/chartex" xmlns:cx6="http://schemas.microsoft.com/office/drawing/2016/5/12/chartex" xmlns:cx7="http://schemas.microsoft.com/office/drawing/2016/5/13/chartex" xmlns:cx8="http://schemas.microsoft.com/office/drawing/2016/5/14/chartex" xmlns:mc="http://schemas.openxmlformats.org/markup-compatibility/2006" xmlns:aink="http://schemas.microsoft.com/office/drawing/2016/ink" xmlns:am3d="http://schemas.microsoft.com/office/drawing/2017/model3d" xmlns:o="urn:schemas-microsoft-com:office:office" xmlns:oel="http://schemas.microsoft.com/office/2019/extlst" xmlns:r="http://schemas.openxmlformats.org/officeDocument/2006/relationships" xmlns:m="http://schemas.openxmlformats.org/officeDocument/2006/math" xmlns:v="urn:schemas-microsoft-com:vml" xmlns:wp14="http://schemas.microsoft.com/office/word/2010/wordprocessingDrawing" xmlns:wp="http://schemas.openxmlformats.org/drawingml/2006/wordprocessingDrawing" xmlns:w10="urn:schemas-microsoft-com:office:word" xmlns:w="http://schemas.openxmlformats.org/wordprocessingml/2006/main" xmlns:w14="http://schemas.microsoft.com/office/word/2010/wordml" xmlns:w15="http://schemas.microsoft.com/office/word/2012/wordml" xmlns:w16cex="http://schemas.microsoft.com/office/word/2018/wordml/cex" xmlns:w16cid="http://schemas.microsoft.com/office/word/2016/wordml/cid" xmlns:w16="http://schemas.microsoft.com/office/word/2018/wordml" xmlns:w16du="http://schemas.microsoft.com/office/word/2023/wordml/word16du" xmlns:w16sdtdh="http://schemas.microsoft.com/office/word/2020/wordml/sdtdatahash" xmlns:w16sdtfl="http://schemas.microsoft.com/office/word/2024/wordml/sdtformatlock" xmlns:w16se="http://schemas.microsoft.com/office/word/2015/wordml/symex" xmlns:wpg="http://schemas.microsoft.com/office/word/2010/wordprocessingGroup" xmlns:wpi="http://schemas.microsoft.com/office/word/2010/wordprocessingInk" xmlns:wne="http://schemas.microsoft.com/office/word/2006/wordml" xmlns:wps="http://schemas.microsoft.com/office/word/2010/wordprocessingShape" mc:Ignorable="w14 w15 w16se w16cid w16 w16cex w16sdtdh w16sdtfl w16du wp14">
   <w:body>
     <w:p>
       <w:pPr>
@@ -79,7 +79,7 @@
     <w:p>
       <w:r>
         <w:pict w14:anchorId="3A77316E">
-          <v:rect id="_x0000_i1067" style="width:0;height:1.5pt" o:hralign="center" o:hrstd="t" o:hr="t" fillcolor="#a0a0a0" stroked="f"/>
+          <v:rect id="_x0000_i1025" style="width:0;height:1.5pt" o:hralign="center" o:hrstd="t" o:hr="t" fillcolor="#a0a0a0" stroked="f"/>
         </w:pict>
       </w:r>
     </w:p>
@@ -155,7 +155,7 @@
     <w:p>
       <w:r>
         <w:pict w14:anchorId="09B02E91">
-          <v:rect id="_x0000_i1068" style="width:0;height:1.5pt" o:hralign="center" o:hrstd="t" o:hr="t" fillcolor="#a0a0a0" stroked="f"/>
+          <v:rect id="_x0000_i1026" style="width:0;height:1.5pt" o:hralign="center" o:hrstd="t" o:hr="t" fillcolor="#a0a0a0" stroked="f"/>
         </w:pict>
       </w:r>
     </w:p>
@@ -246,7 +246,7 @@
     <w:p>
       <w:r>
         <w:pict w14:anchorId="46F72FD7">
-          <v:rect id="_x0000_i1069" style="width:0;height:1.5pt" o:hralign="center" o:hrstd="t" o:hr="t" fillcolor="#a0a0a0" stroked="f"/>
+          <v:rect id="_x0000_i1027" style="width:0;height:1.5pt" o:hralign="center" o:hrstd="t" o:hr="t" fillcolor="#a0a0a0" stroked="f"/>
         </w:pict>
       </w:r>
     </w:p>
@@ -323,7 +323,7 @@
     <w:p>
       <w:r>
         <w:pict w14:anchorId="13F329AB">
-          <v:rect id="_x0000_i1070" style="width:0;height:1.5pt" o:hralign="center" o:hrstd="t" o:hr="t" fillcolor="#a0a0a0" stroked="f"/>
+          <v:rect id="_x0000_i1028" style="width:0;height:1.5pt" o:hralign="center" o:hrstd="t" o:hr="t" fillcolor="#a0a0a0" stroked="f"/>
         </w:pict>
       </w:r>
     </w:p>
@@ -407,7 +407,7 @@
     <w:p>
       <w:r>
         <w:pict w14:anchorId="72924170">
-          <v:rect id="_x0000_i1071" style="width:0;height:1.5pt" o:hralign="center" o:hrstd="t" o:hr="t" fillcolor="#a0a0a0" stroked="f"/>
+          <v:rect id="_x0000_i1029" style="width:0;height:1.5pt" o:hralign="center" o:hrstd="t" o:hr="t" fillcolor="#a0a0a0" stroked="f"/>
         </w:pict>
       </w:r>
     </w:p>
@@ -483,7 +483,7 @@
     <w:p>
       <w:r>
         <w:pict w14:anchorId="6FE547FE">
-          <v:rect id="_x0000_i1072" style="width:0;height:1.5pt" o:hralign="center" o:hrstd="t" o:hr="t" fillcolor="#a0a0a0" stroked="f"/>
+          <v:rect id="_x0000_i1030" style="width:0;height:1.5pt" o:hralign="center" o:hrstd="t" o:hr="t" fillcolor="#a0a0a0" stroked="f"/>
         </w:pict>
       </w:r>
     </w:p>
@@ -559,7 +559,7 @@
     <w:p>
       <w:r>
         <w:pict w14:anchorId="4A07C11A">
-          <v:rect id="_x0000_i1073" style="width:0;height:1.5pt" o:hralign="center" o:hrstd="t" o:hr="t" fillcolor="#a0a0a0" stroked="f"/>
+          <v:rect id="_x0000_i1031" style="width:0;height:1.5pt" o:hralign="center" o:hrstd="t" o:hr="t" fillcolor="#a0a0a0" stroked="f"/>
         </w:pict>
       </w:r>
     </w:p>
@@ -642,6 +642,123 @@
       </w:r>
     </w:p>
     <w:p/>
+    <w:p/>
+    <w:p>
+      <w:pPr>
+        <w:pStyle w:val="Tittel"/>
+      </w:pPr>
+      <w:proofErr w:type="spellStart"/>
+      <w:r>
+        <w:t>EiendomsLogg</w:t>
+      </w:r>
+      <w:proofErr w:type="spellEnd"/>
+    </w:p>
+    <w:p>
+      <w:r>
+        <w:t xml:space="preserve">Program brukt: </w:t>
+      </w:r>
+    </w:p>
+    <w:p>
+      <w:pPr>
+        <w:pStyle w:val="Listeavsnitt"/>
+        <w:numPr>
+          <w:ilvl w:val="0"/>
+          <w:numId w:val="9"/>
+        </w:numPr>
+      </w:pPr>
+      <w:hyperlink r:id="rId5" w:history="1">
+        <w:r>
+          <w:rPr>
+            <w:rStyle w:val="Hyperkobling"/>
+          </w:rPr>
+          <w:t>https://dashboard.stripe.com/acct_1U8PoFF5tNAEz5mI/test/dashboard</w:t>
+        </w:r>
+      </w:hyperlink>
+    </w:p>
+    <w:p>
+      <w:pPr>
+        <w:pStyle w:val="Listeavsnitt"/>
+        <w:numPr>
+          <w:ilvl w:val="0"/>
+          <w:numId w:val="9"/>
+        </w:numPr>
+      </w:pPr>
+      <w:hyperlink r:id="rId6" w:history="1">
+        <w:r>
+          <w:rPr>
+            <w:rStyle w:val="Hyperkobling"/>
+          </w:rPr>
+          <w:t>https://claude.ai/chat/bbf5b003-eaa0-4e15-8efd-585de2c093e8</w:t>
+        </w:r>
+      </w:hyperlink>
+    </w:p>
+    <w:p>
+      <w:pPr>
+        <w:pStyle w:val="Listeavsnitt"/>
+        <w:numPr>
+          <w:ilvl w:val="0"/>
+          <w:numId w:val="9"/>
+        </w:numPr>
+      </w:pPr>
+      <w:hyperlink r:id="rId7" w:history="1">
+        <w:r>
+          <w:rPr>
+            <w:rStyle w:val="Hyperkobling"/>
+          </w:rPr>
+          <w:t>https://supabase.com/dashboard/project/kvbnmdjrdgeqfaagmjgt</w:t>
+        </w:r>
+      </w:hyperlink>
+    </w:p>
+    <w:p>
+      <w:pPr>
+        <w:pStyle w:val="Listeavsnitt"/>
+        <w:numPr>
+          <w:ilvl w:val="0"/>
+          <w:numId w:val="9"/>
+        </w:numPr>
+      </w:pPr>
+      <w:hyperlink r:id="rId8" w:history="1">
+        <w:r>
+          <w:rPr>
+            <w:rStyle w:val="Hyperkobling"/>
+          </w:rPr>
+          <w:t>https://vercel.com/new</w:t>
+        </w:r>
+      </w:hyperlink>
+      <w:r>
+        <w:t xml:space="preserve"> (har jeg brukt den </w:t>
+      </w:r>
+      <w:proofErr w:type="spellStart"/>
+      <w:r>
+        <w:t>egt</w:t>
+      </w:r>
+      <w:proofErr w:type="spellEnd"/>
+      <w:r>
+        <w:t>?)</w:t>
+      </w:r>
+    </w:p>
+    <w:p>
+      <w:pPr>
+        <w:pStyle w:val="Listeavsnitt"/>
+        <w:numPr>
+          <w:ilvl w:val="0"/>
+          <w:numId w:val="9"/>
+        </w:numPr>
+      </w:pPr>
+    </w:p>
+    <w:p>
+      <w:r>
+        <w:t xml:space="preserve">AS navn: </w:t>
+      </w:r>
+      <w:proofErr w:type="spellStart"/>
+      <w:r>
+        <w:t>EnkelOrden</w:t>
+      </w:r>
+      <w:proofErr w:type="spellEnd"/>
+      <w:r>
+        <w:t>?</w:t>
+      </w:r>
+    </w:p>
     <w:sectPr>
       <w:pgSz w:w="11906" w:h="16838"/>
       <w:pgMar w:top="1417" w:right="1417" w:bottom="1417" w:left="1417" w:header="708" w:footer="708" w:gutter="0"/>
@@ -653,7 +770,7 @@
 </file>
 
 <file path=word/numbering.xml><?xml version="1.0" encoding="utf-8"?>
-<w:numbering xmlns:wpc="http://schemas.microsoft.com/office/word/2010/wordprocessingCanvas" xmlns:cx="http://schemas.microsoft.com/office/drawing/2014/chartex" xmlns:cx1="http://schemas.microsoft.com/office/drawing/2015/9/8/chartex" xmlns:cx2="http://schemas.microsoft.com/office/drawing/2015/10/21/chartex" xmlns:cx3="http://schemas.microsoft.com/office/drawing/2016/5/9/chartex" xmlns:cx4="http://schemas.microsoft.com/office/drawing/2016/5/10/chartex" xmlns:cx5="http://schemas.microsoft.com/office/drawing/2016/5/11/chartex" xmlns:cx6="http://schemas.microsoft.com/office/drawing/2016/5/12/chartex" xmlns:cx7="http://schemas.microsoft.com/office/drawing/2016/5/13/chartex" xmlns:cx8="http://schemas.microsoft.com/office/drawing/2016/5/14/chartex" xmlns:mc="http://schemas.openxmlformats.org/markup-compatibility/2006" xmlns:aink="http://schemas.microsoft.com/office/drawing/2016/ink" xmlns:am3d="http://schemas.microsoft.com/office/drawing/2017/model3d" xmlns:o="urn:schemas-microsoft-com:office:office" xmlns:oel="http://schemas.microsoft.com/office/2019/extlst" xmlns:r="http://schemas.openxmlformats.org/officeDocument/2006/relationships" xmlns:m="http://schemas.openxmlformats.org/officeDocument/2006/math" xmlns:v="urn:schemas-microsoft-com:vml" xmlns:wp14="http://schemas.microsoft.com/office/word/2010/wordprocessingDrawing" xmlns:wp="http://schemas.openxmlformats.org/drawingml/2006/wordprocessingDrawing" xmlns:w10="urn:schemas-microsoft-com:office:word" xmlns:w="http://schemas.openxmlformats.org/wordprocessingml/2006/main" xmlns:w14="http://schemas.microsoft.com/office/word/2010/wordml" xmlns:w15="http://schemas.microsoft.com/office/word/2012/wordml" xmlns:w16cei="http://schemas.microsoft.com/office/word/2026/wordml/cei" xmlns:w16cex="http://schemas.microsoft.com/office/word/2018/wordml/cex" xmlns:w16cid="http://schemas.microsoft.com/office/word/2016/wordml/cid" xmlns:w16="http://schemas.microsoft.com/office/word/2018/wordml" xmlns:w16du="http://schemas.microsoft.com/office/word/2023/wordml/word16du" xmlns:w16sdtdh="http://schemas.microsoft.com/office/word/2020/wordml/sdtdatahash" xmlns:w16sdtfl="http://schemas.microsoft.com/office/word/2024/wordml/sdtformatlock" xmlns:w16se="http://schemas.microsoft.com/office/word/2015/wordml/symex" xmlns:wpg="http://schemas.microsoft.com/office/word/2010/wordprocessingGroup" xmlns:wpi="http://schemas.microsoft.com/office/word/2010/wordprocessingInk" xmlns:wne="http://schemas.microsoft.com/office/word/2006/wordml" xmlns:wps="http://schemas.microsoft.com/office/word/2010/wordprocessingShape" mc:Ignorable="w14 w15 w16se w16cid w16 w16cex w16sdtdh w16sdtfl w16du wp14">
+<w:numbering xmlns:wpc="http://schemas.microsoft.com/office/word/2010/wordprocessingCanvas" xmlns:cx="http://schemas.microsoft.com/office/drawing/2014/chartex" xmlns:cx1="http://schemas.microsoft.com/office/drawing/2015/9/8/chartex" xmlns:cx2="http://schemas.microsoft.com/office/drawing/2015/10/21/chartex" xmlns:cx3="http://schemas.microsoft.com/office/drawing/2016/5/9/chartex" xmlns:cx4="http://schemas.microsoft.com/office/drawing/2016/5/10/chartex" xmlns:cx5="http://schemas.microsoft.com/office/drawing/2016/5/11/chartex" xmlns:cx6="http://schemas.microsoft.com/office/drawing/2016/5/12/chartex" xmlns:cx7="http://schemas.microsoft.com/office/drawing/2016/5/13/chartex" xmlns:cx8="http://schemas.microsoft.com/office/drawing/2016/5/14/chartex" xmlns:mc="http://schemas.openxmlformats.org/markup-compatibility/2006" xmlns:aink="http://schemas.microsoft.com/office/drawing/2016/ink" xmlns:am3d="http://schemas.microsoft.com/office/drawing/2017/model3d" xmlns:o="urn:schemas-microsoft-com:office:office" xmlns:oel="http://schemas.microsoft.com/office/2019/extlst" xmlns:r="http://schemas.openxmlformats.org/officeDocument/2006/relationships" xmlns:m="http://schemas.openxmlformats.org/officeDocument/2006/math" xmlns:v="urn:schemas-microsoft-com:vml" xmlns:wp14="http://schemas.microsoft.com/office/word/2010/wordprocessingDrawing" xmlns:wp="http://schemas.openxmlformats.org/drawingml/2006/wordprocessingDrawing" xmlns:w10="urn:schemas-microsoft-com:office:word" xmlns:w="http://schemas.openxmlformats.org/wordprocessingml/2006/main" xmlns:w14="http://schemas.microsoft.com/office/word/2010/wordml" xmlns:w15="http://schemas.microsoft.com/office/word/2012/wordml" xmlns:w16cex="http://schemas.microsoft.com/office/word/2018/wordml/cex" xmlns:w16cid="http://schemas.microsoft.com/office/word/2016/wordml/cid" xmlns:w16="http://schemas.microsoft.com/office/word/2018/wordml" xmlns:w16du="http://schemas.microsoft.com/office/word/2023/wordml/word16du" xmlns:w16sdtdh="http://schemas.microsoft.com/office/word/2020/wordml/sdtdatahash" xmlns:w16sdtfl="http://schemas.microsoft.com/office/word/2024/wordml/sdtformatlock" xmlns:w16se="http://schemas.microsoft.com/office/word/2015/wordml/symex" xmlns:wpg="http://schemas.microsoft.com/office/word/2010/wordprocessingGroup" xmlns:wpi="http://schemas.microsoft.com/office/word/2010/wordprocessingInk" xmlns:wne="http://schemas.microsoft.com/office/word/2006/wordml" xmlns:wps="http://schemas.microsoft.com/office/word/2010/wordprocessingShape" mc:Ignorable="w14 w15 w16se w16cid w16 w16cex w16sdtdh w16sdtfl w16du wp14">
   <w:abstractNum w:abstractNumId="0" w15:restartNumberingAfterBreak="0">
     <w:nsid w:val="05EC5198"/>
     <w:multiLevelType w:val="multilevel"/>
@@ -804,6 +921,118 @@
     </w:lvl>
   </w:abstractNum>
   <w:abstractNum w:abstractNumId="1" w15:restartNumberingAfterBreak="0">
+    <w:nsid w:val="306C6186"/>
+    <w:multiLevelType w:val="hybridMultilevel"/>
+    <w:tmpl w:val="042C855C"/>
+    <w:lvl w:ilvl="0" w:tplc="5F884524">
+      <w:numFmt w:val="bullet"/>
+      <w:lvlText w:val="-"/>
+      <w:lvlJc w:val="left"/>
+      <w:pPr>
+        <w:ind w:left="720" w:hanging="360"/>
+      </w:pPr>
+      <w:rPr>
+        <w:rFonts w:ascii="Aptos" w:eastAsiaTheme="minorHAnsi" w:hAnsi="Aptos" w:cstheme="minorBidi" w:hint="default"/>
+      </w:rPr>
+    </w:lvl>
+    <w:lvl w:ilvl="1" w:tplc="04140003" w:tentative="1">
+      <w:start w:val="1"/>
+      <w:numFmt w:val="bullet"/>
+      <w:lvlText w:val="o"/>
+      <w:lvlJc w:val="left"/>
+      <w:pPr>
+        <w:ind w:left="1440" w:hanging="360"/>
+      </w:pPr>
+      <w:rPr>
+        <w:rFonts w:ascii="Courier New" w:hAnsi="Courier New" w:cs="Courier New" w:hint="default"/>
+      </w:rPr>
+    </w:lvl>
+    <w:lvl w:ilvl="2" w:tplc="04140005" w:tentative="1">
+      <w:start w:val="1"/>
+      <w:numFmt w:val="bullet"/>
+      <w:lvlText w:val=""/>
+      <w:lvlJc w:val="left"/>
+      <w:pPr>
+        <w:ind w:left="2160" w:hanging="360"/>
+      </w:pPr>
+      <w:rPr>
+        <w:rFonts w:ascii="Wingdings" w:hAnsi="Wingdings" w:hint="default"/>
+      </w:rPr>
+    </w:lvl>
+    <w:lvl w:ilvl="3" w:tplc="04140001" w:tentative="1">
+      <w:start w:val="1"/>
+      <w:numFmt w:val="bullet"/>
+      <w:lvlText w:val=""/>
+      <w:lvlJc w:val="left"/>
+      <w:pPr>
+        <w:ind w:left="2880" w:hanging="360"/>
+      </w:pPr>
+      <w:rPr>
+        <w:rFonts w:ascii="Symbol" w:hAnsi="Symbol" w:hint="default"/>
+      </w:rPr>
+    </w:lvl>
+    <w:lvl w:ilvl="4" w:tplc="04140003" w:tentative="1">
+      <w:start w:val="1"/>
+      <w:numFmt w:val="bullet"/>
+      <w:lvlText w:val="o"/>
+      <w:lvlJc w:val="left"/>
+      <w:pPr>
+        <w:ind w:left="3600" w:hanging="360"/>
+      </w:pPr>
+      <w:rPr>
+        <w:rFonts w:ascii="Courier New" w:hAnsi="Courier New" w:cs="Courier New" w:hint="default"/>
+      </w:rPr>
+    </w:lvl>
+    <w:lvl w:ilvl="5" w:tplc="04140005" w:tentative="1">
+      <w:start w:val="1"/>
+      <w:numFmt w:val="bullet"/>
+      <w:lvlText w:val=""/>
+      <w:lvlJc w:val="left"/>
+      <w:pPr>
+        <w:ind w:left="4320" w:hanging="360"/>
+      </w:pPr>
+      <w:rPr>
+        <w:rFonts w:ascii="Wingdings" w:hAnsi="Wingdings" w:hint="default"/>
+      </w:rPr>
+    </w:lvl>
+    <w:lvl w:ilvl="6" w:tplc="04140001" w:tentative="1">
+      <w:start w:val="1"/>
+      <w:numFmt w:val="bullet"/>
+      <w:lvlText w:val=""/>
+      <w:lvlJc w:val="left"/>
+      <w:pPr>
+        <w:ind w:left="5040" w:hanging="360"/>
+      </w:pPr>
+      <w:rPr>
+        <w:rFonts w:ascii="Symbol" w:hAnsi="Symbol" w:hint="default"/>
+      </w:rPr>
+    </w:lvl>
+    <w:lvl w:ilvl="7" w:tplc="04140003" w:tentative="1">
+      <w:start w:val="1"/>
+      <w:numFmt w:val="bullet"/>
+      <w:lvlText w:val="o"/>
+      <w:lvlJc w:val="left"/>
+      <w:pPr>
+        <w:ind w:left="5760" w:hanging="360"/>
+      </w:pPr>
+      <w:rPr>
+        <w:rFonts w:ascii="Courier New" w:hAnsi="Courier New" w:cs="Courier New" w:hint="default"/>
+      </w:rPr>
+    </w:lvl>
+    <w:lvl w:ilvl="8" w:tplc="04140005" w:tentative="1">
+      <w:start w:val="1"/>
+      <w:numFmt w:val="bullet"/>
+      <w:lvlText w:val=""/>
+      <w:lvlJc w:val="left"/>
+      <w:pPr>
+        <w:ind w:left="6480" w:hanging="360"/>
+      </w:pPr>
+      <w:rPr>
+        <w:rFonts w:ascii="Wingdings" w:hAnsi="Wingdings" w:hint="default"/>
+      </w:rPr>
+    </w:lvl>
+  </w:abstractNum>
+  <w:abstractNum w:abstractNumId="2" w15:restartNumberingAfterBreak="0">
     <w:nsid w:val="3A690C9C"/>
     <w:multiLevelType w:val="multilevel"/>
     <w:tmpl w:val="D74045DA"/>
@@ -952,7 +1181,7 @@
       </w:rPr>
     </w:lvl>
   </w:abstractNum>
-  <w:abstractNum w:abstractNumId="2" w15:restartNumberingAfterBreak="0">
+  <w:abstractNum w:abstractNumId="3" w15:restartNumberingAfterBreak="0">
     <w:nsid w:val="57AC2FB7"/>
     <w:multiLevelType w:val="multilevel"/>
     <w:tmpl w:val="53020F5E"/>
@@ -1101,7 +1330,7 @@
       </w:rPr>
     </w:lvl>
   </w:abstractNum>
-  <w:abstractNum w:abstractNumId="3" w15:restartNumberingAfterBreak="0">
+  <w:abstractNum w:abstractNumId="4" w15:restartNumberingAfterBreak="0">
     <w:nsid w:val="5AB818F5"/>
     <w:multiLevelType w:val="multilevel"/>
     <w:tmpl w:val="2B8CEC6A"/>
@@ -1250,7 +1479,7 @@
       </w:rPr>
     </w:lvl>
   </w:abstractNum>
-  <w:abstractNum w:abstractNumId="4" w15:restartNumberingAfterBreak="0">
+  <w:abstractNum w:abstractNumId="5" w15:restartNumberingAfterBreak="0">
     <w:nsid w:val="6ED658FE"/>
     <w:multiLevelType w:val="multilevel"/>
     <w:tmpl w:val="7D0CDB06"/>
@@ -1399,7 +1628,7 @@
       </w:rPr>
     </w:lvl>
   </w:abstractNum>
-  <w:abstractNum w:abstractNumId="5" w15:restartNumberingAfterBreak="0">
+  <w:abstractNum w:abstractNumId="6" w15:restartNumberingAfterBreak="0">
     <w:nsid w:val="705E24A0"/>
     <w:multiLevelType w:val="multilevel"/>
     <w:tmpl w:val="798EC53C"/>
@@ -1548,7 +1777,7 @@
       </w:rPr>
     </w:lvl>
   </w:abstractNum>
-  <w:abstractNum w:abstractNumId="6" w15:restartNumberingAfterBreak="0">
+  <w:abstractNum w:abstractNumId="7" w15:restartNumberingAfterBreak="0">
     <w:nsid w:val="77ED0DDA"/>
     <w:multiLevelType w:val="multilevel"/>
     <w:tmpl w:val="45649944"/>
@@ -1697,7 +1926,7 @@
       </w:rPr>
     </w:lvl>
   </w:abstractNum>
-  <w:abstractNum w:abstractNumId="7" w15:restartNumberingAfterBreak="0">
+  <w:abstractNum w:abstractNumId="8" w15:restartNumberingAfterBreak="0">
     <w:nsid w:val="7A8059EF"/>
     <w:multiLevelType w:val="multilevel"/>
     <w:tmpl w:val="FC8AC31E"/>
@@ -1847,28 +2076,31 @@
     </w:lvl>
   </w:abstractNum>
   <w:num w:numId="1" w16cid:durableId="414057308">
-    <w:abstractNumId w:val="4"/>
+    <w:abstractNumId w:val="5"/>
   </w:num>
   <w:num w:numId="2" w16cid:durableId="912738638">
     <w:abstractNumId w:val="0"/>
   </w:num>
   <w:num w:numId="3" w16cid:durableId="1676301629">
+    <w:abstractNumId w:val="8"/>
+  </w:num>
+  <w:num w:numId="4" w16cid:durableId="569317012">
+    <w:abstractNumId w:val="2"/>
+  </w:num>
+  <w:num w:numId="5" w16cid:durableId="1661343700">
+    <w:abstractNumId w:val="3"/>
+  </w:num>
+  <w:num w:numId="6" w16cid:durableId="753670121">
+    <w:abstractNumId w:val="4"/>
+  </w:num>
+  <w:num w:numId="7" w16cid:durableId="122895133">
+    <w:abstractNumId w:val="6"/>
+  </w:num>
+  <w:num w:numId="8" w16cid:durableId="463160968">
     <w:abstractNumId w:val="7"/>
   </w:num>
-  <w:num w:numId="4" w16cid:durableId="569317012">
+  <w:num w:numId="9" w16cid:durableId="1778678492">
     <w:abstractNumId w:val="1"/>
-  </w:num>
-  <w:num w:numId="5" w16cid:durableId="1661343700">
-    <w:abstractNumId w:val="2"/>
-  </w:num>
-  <w:num w:numId="6" w16cid:durableId="753670121">
-    <w:abstractNumId w:val="3"/>
-  </w:num>
-  <w:num w:numId="7" w16cid:durableId="122895133">
-    <w:abstractNumId w:val="5"/>
-  </w:num>
-  <w:num w:numId="8" w16cid:durableId="463160968">
-    <w:abstractNumId w:val="6"/>
   </w:num>
 </w:numbering>
 </file>
@@ -2476,6 +2708,7 @@
   <w:style w:type="character" w:default="1" w:styleId="Standardskriftforavsnitt">
     <w:name w:val="Default Paragraph Font"/>
     <w:uiPriority w:val="1"/>
+    <w:semiHidden/>
     <w:unhideWhenUsed/>
   </w:style>
   <w:style w:type="table" w:default="1" w:styleId="Vanligtabell">
@@ -2787,6 +3020,29 @@
       <w:smallCaps/>
       <w:color w:val="0F4761" w:themeColor="accent1" w:themeShade="BF"/>
       <w:spacing w:val="5"/>
+    </w:rPr>
+  </w:style>
+  <w:style w:type="character" w:styleId="Hyperkobling">
+    <w:name w:val="Hyperlink"/>
+    <w:basedOn w:val="Standardskriftforavsnitt"/>
+    <w:uiPriority w:val="99"/>
+    <w:unhideWhenUsed/>
+    <w:rsid w:val="00B91FA1"/>
+    <w:rPr>
+      <w:color w:val="467886" w:themeColor="hyperlink"/>
+      <w:u w:val="single"/>
+    </w:rPr>
+  </w:style>
+  <w:style w:type="character" w:styleId="Ulstomtale">
+    <w:name w:val="Unresolved Mention"/>
+    <w:basedOn w:val="Standardskriftforavsnitt"/>
+    <w:uiPriority w:val="99"/>
+    <w:semiHidden/>
+    <w:unhideWhenUsed/>
+    <w:rsid w:val="00B91FA1"/>
+    <w:rPr>
+      <w:color w:val="605E5C"/>
+      <w:shd w:val="clear" w:color="auto" w:fill="E1DFDD"/>
     </w:rPr>
   </w:style>
 </w:styles>

</xml_diff>